<commit_message>
docs: point the report's repository links to samarkhatib/SmartRail
Co-Authored-By: Claude Opus 5.5 <noreply@anthropic.com>
</commit_message>
<xml_diff>
--- a/Documentation/SmartRail_Report.docx
+++ b/Documentation/SmartRail_Report.docx
@@ -8428,7 +8428,7 @@
             <w:szCs w:val="21"/>
             <w:u w:val="single"/>
           </w:rPr>
-          <w:t>https://github.com/abedazem13/SmartRail</w:t>
+          <w:t>https://github.com/samarkhatib/SmartRail</w:t>
         </w:r>
       </w:hyperlink>
     </w:p>
@@ -15989,7 +15989,7 @@
             <w:szCs w:val="17"/>
             <w:u w:val="single"/>
           </w:rPr>
-          <w:t>https://github.com/abedazem13/SmartRail</w:t>
+          <w:t>https://github.com/samarkhatib/SmartRail</w:t>
         </w:r>
       </w:hyperlink>
     </w:p>

</xml_diff>